<commit_message>
pdate docs: add Blink Pay and privacy policy to website guide and CLAUDE.md
</commit_message>
<xml_diff>
--- a/UCRC Website Guide.docx
+++ b/UCRC Website Guide.docx
@@ -152,7 +152,7 @@
           <w:color w:val="555555"/>
           <w:sz w:val="22"/>
         </w:rPr>
-        <w:t>The website runs on three free-tier services. Two of them are free indefinitely, but one requires an active subscription — the domain name.</w:t>
+        <w:t xml:space="preserve">The website runs on four services — three are free, one is transaction-based, and one requires an annual subscription.</w:t>
       </w:r>
     </w:p>
     <w:p>
@@ -324,6 +324,36 @@
     </w:p>
     <w:p>
       <w:pPr>
+        <w:spacing w:before="280" w:after="80"/>
+      </w:pPr>
+      <w:r>
+        <w:rPr>
+          <w:rFonts w:ascii="Arial Narrow" w:hAnsi="Arial Narrow"/>
+          <w:b/>
+          <w:i w:val="0"/>
+          <w:color w:val="1A1A1A"/>
+          <w:sz w:val="26"/>
+        </w:rPr>
+        <w:t xml:space="preserve">Blink Pay (per-transaction fees — processes online payments)</w:t>
+      </w:r>
+    </w:p>
+    <w:p>
+      <w:pPr>
+        <w:spacing w:after="120"/>
+      </w:pPr>
+      <w:r>
+        <w:rPr>
+          <w:rFonts w:ascii="Arial" w:hAnsi="Arial"/>
+          <w:b w:val="0"/>
+          <w:i w:val="0"/>
+          <w:color w:val="555555"/>
+          <w:sz w:val="22"/>
+        </w:rPr>
+        <w:t xml:space="preserve">Blink Pay is the payment gateway used to accept online fee payments from members. It is free to integrate — Blink Pay charges a small per-transaction fee when members pay. For current rates see blinkpay.co.nz/pricing. Contact: support@blinkpay.co.nz.</w:t>
+      </w:r>
+    </w:p>
+    <w:p>
+      <w:pPr>
         <w:spacing w:before="440" w:after="120"/>
         <w:pBdr>
           <w:bottom w:val="single" w:sz="6" w:space="4" w:color="E8A020"/>
@@ -2067,7 +2097,7 @@
           <w:color w:val="555555"/>
           <w:sz w:val="22"/>
         </w:rPr>
-        <w:t xml:space="preserve">Blink Pay is currently running in test mode (called "sandbox"). This means the payment pages look and function exactly like the real thing, but no actual money is transferred. Before members can use Blink Pay for real payments, the club needs production credentials from Blink Pay.</w:t>
+        <w:t xml:space="preserve">Blink Pay is currently running in test mode (called “sandbox”). This means the payment pages look and function exactly like the real thing, but no actual money is transferred. The club has completed onboarding with Blink Pay. Once production credentials are received, real payments can be enabled.</w:t>
       </w:r>
     </w:p>
     <w:p>
@@ -2083,7 +2113,7 @@
           <w:color w:val="555555"/>
           <w:sz w:val="22"/>
         </w:rPr>
-        <w:t xml:space="preserve">Go to blinkpay.co.nz and register the club as a merchant to receive production API credentials.</w:t>
+        <w:t xml:space="preserve">When Blink Pay provides production credentials, update three environment variables in Netlify: BLINK_CLIENT_ID, BLINK_CLIENT_SECRET, and change BLINK_ENV from “sandbox” to “production”. Ask Claude to help if needed.</w:t>
       </w:r>
     </w:p>
     <w:p>
@@ -2496,6 +2526,66 @@
           <w:sz w:val="22"/>
         </w:rPr>
         <w:t>Invite the new president to both services. Use the club email address for all service accounts — not personal emails — so access is not lost when someone leaves.</w:t>
+      </w:r>
+    </w:p>
+    <w:p>
+      <w:pPr>
+        <w:spacing w:before="280" w:after="80"/>
+      </w:pPr>
+      <w:r>
+        <w:rPr>
+          <w:rFonts w:ascii="Arial Narrow" w:hAnsi="Arial Narrow"/>
+          <w:b/>
+          <w:i w:val="0"/>
+          <w:color w:val="1A1A1A"/>
+          <w:sz w:val="26"/>
+        </w:rPr>
+        <w:t xml:space="preserve">Blink Pay</w:t>
+      </w:r>
+    </w:p>
+    <w:p>
+      <w:pPr>
+        <w:spacing w:after="120"/>
+      </w:pPr>
+      <w:r>
+        <w:rPr>
+          <w:rFonts w:ascii="Arial" w:hAnsi="Arial"/>
+          <w:b w:val="0"/>
+          <w:i w:val="0"/>
+          <w:color w:val="555555"/>
+          <w:sz w:val="22"/>
+        </w:rPr>
+        <w:t xml:space="preserve">Invite the new president to the Blink Pay merchant portal. Use the club email address. Blink Pay processes online fee payments — for any payment issues, contact support@blinkpay.co.nz.</w:t>
+      </w:r>
+    </w:p>
+    <w:p>
+      <w:pPr>
+        <w:spacing w:before="280" w:after="80"/>
+      </w:pPr>
+      <w:r>
+        <w:rPr>
+          <w:rFonts w:ascii="Arial Narrow" w:hAnsi="Arial Narrow"/>
+          <w:b/>
+          <w:i w:val="0"/>
+          <w:color w:val="1A1A1A"/>
+          <w:sz w:val="26"/>
+        </w:rPr>
+        <w:t xml:space="preserve">Privacy policy</w:t>
+      </w:r>
+    </w:p>
+    <w:p>
+      <w:pPr>
+        <w:spacing w:after="120"/>
+      </w:pPr>
+      <w:r>
+        <w:rPr>
+          <w:rFonts w:ascii="Arial" w:hAnsi="Arial"/>
+          <w:b w:val="0"/>
+          <w:i w:val="0"/>
+          <w:color w:val="555555"/>
+          <w:sz w:val="22"/>
+        </w:rPr>
+        <w:t xml:space="preserve">The club has a published privacy policy at privacy.html, required for Blink Pay and the NZ Privacy Act 2020. Update the “Last updated” date in privacy.html if the policy ever changes.</w:t>
       </w:r>
     </w:p>
     <w:p>

</xml_diff>